<commit_message>
v1.3 Foreword: trim changelog paragraph
Removed the long revision-history paragraph from the Foreword. The
Foreword's job is AAFL positioning (independent IP, synthesis
discipline, critique invitation), not version housekeeping. Version
information already lives in the frontmatter, cover page, suggested
citation, §11 IP and authorship block, and CHANGELOG.md — adding a
fifth surface for version meta was redundant. Replaced with the
minimal "This is v1.3 (2026-05-20)." line.

Rebuilt HTML, PDF, and DOCX.

Co-Authored-By: Claude Opus 4.7 <noreply@anthropic.com>
</commit_message>
<xml_diff>
--- a/whitepaper/aafl-whitepaper-v1.3.docx
+++ b/whitepaper/aafl-whitepaper-v1.3.docx
@@ -128,38 +128,7 @@
         <w:pStyle w:val="BodyText"/>
       </w:pPr>
       <w:r>
-        <w:t xml:space="preserve">This is v1.3 (2026-05-20). Revision history is documented in</w:t>
-      </w:r>
-      <w:r>
-        <w:t xml:space="preserve"> </w:t>
-      </w:r>
-      <w:r>
-        <w:rPr>
-          <w:rStyle w:val="VerbatimChar"/>
-        </w:rPr>
-        <w:t xml:space="preserve">CHANGELOG.md</w:t>
-      </w:r>
-      <w:r>
-        <w:t xml:space="preserve"> </w:t>
-      </w:r>
-      <w:r>
-        <w:t xml:space="preserve">in the project repository; v1.3 incorporates a complete forensic citation pass over v1.2.1, three new bibliography sections (learning-sciences scaffolding tradition, AIED empirical baseline, expanded critic-camp engagement), a license transition from proprietary to</w:t>
-      </w:r>
-      <w:r>
-        <w:t xml:space="preserve"> </w:t>
-      </w:r>
-      <w:r>
-        <w:rPr>
-          <w:b/>
-          <w:bCs/>
-        </w:rPr>
-        <w:t xml:space="preserve">Creative Commons Attribution-NonCommercial 4.0 International (CC BY-NC 4.0)</w:t>
-      </w:r>
-      <w:r>
-        <w:t xml:space="preserve"> </w:t>
-      </w:r>
-      <w:r>
-        <w:t xml:space="preserve">to maximize citability of the deposited artifact, and minor editorial corrections throughout. Architecture, eight HITL gates, PRS, and governance layer are unchanged in substance from v1.2.1.</w:t>
+        <w:t xml:space="preserve">This is v1.3 (2026-05-20).</w:t>
       </w:r>
     </w:p>
     <w:p>

</xml_diff>

<commit_message>
v1.3 citation cleanup: APA 7 form, ghost activation, Hardman disambiguation
Second-pass citation-check (ars-citation-check) surfaced APA 7 form errors
and ghost references. All applied:

- Hardman 2025b → 2025 (single Substack entry; PDF version not citable)
- Removed possessive from parenthetical (Messick)
- Kirkpatrick year aligned to bibliography (2016, 1959 noted in prose)
- Product/lab labels moved out of parentheticals (HELM, EleutherAI, HDSR)
- et al. enforced from first citation for 3+ authors (Brynjolfsson, Holmes)
- Publisher names stripped from §9 narrative parentheticals
- Added missing parentheticals in §9 pedagogical-design heritage
- Activated ghost refs: Quality Matters, W3C, SAE, NIST
- Flagged arXiv preprints (Arya Mary, Zhang)
- Removed Clark (2025) ghost bibliography entry
- Rebuilt HTML, PDF, DOCX

Co-Authored-By: Claude Opus 4.7 (1M context) <noreply@anthropic.com>
</commit_message>
<xml_diff>
--- a/whitepaper/aafl-whitepaper-v1.3.docx
+++ b/whitepaper/aafl-whitepaper-v1.3.docx
@@ -2173,7 +2173,7 @@
         <w:t xml:space="preserve"> </w:t>
       </w:r>
       <w:r>
-        <w:t xml:space="preserve">is the institutional infrastructure. It captures audit trail (chain of custody for every agent-generated artifact, model version recorded, prompt-and-response archived for the contract retention window), classification handling (FedRAMP, NIST 800-171, CUI marking, ITAR/EAR where applicable), accreditation alignment (ACE evaluator expectations, Quality Matters Standards 2/3/8, WCAG 2.1 AA + Section 508), escalation paths (what happens when the human reviewer disagrees with the agent's output, when does human override, when does the disagreement escalate), and</w:t>
+        <w:t xml:space="preserve">is the institutional infrastructure. It captures audit trail (chain of custody for every agent-generated artifact, model version recorded, prompt-and-response archived for the contract retention window), classification handling (FedRAMP, NIST 800-171, CUI marking, ITAR/EAR where applicable), accreditation alignment (ACE evaluator expectations, Quality Matters Standards 2/3/8 (Quality Matters, 2023), WCAG 2.1 AA + Section 508 (W3C, 2018)), escalation paths (what happens when the human reviewer disagrees with the agent's output, when does human override, when does the disagreement escalate), and</w:t>
       </w:r>
       <w:r>
         <w:t xml:space="preserve"> </w:t>
@@ -6053,13 +6053,13 @@
           <w:b/>
           <w:bCs/>
         </w:rPr>
-        <w:t xml:space="preserve">SAE J3016 (driving automation levels 0–5).</w:t>
-      </w:r>
-      <w:r>
-        <w:t xml:space="preserve"> </w:t>
-      </w:r>
-      <w:r>
-        <w:t xml:space="preserve">The SAE on-road automation standard grades vehicle systems from no automation (L0) through full driving automation (L5) by reference to who is responsible for the dynamic driving task and under what conditions. The PRS borrows the</w:t>
+        <w:t xml:space="preserve">SAE J3016 (driving automation levels 0–5)</w:t>
+      </w:r>
+      <w:r>
+        <w:t xml:space="preserve"> </w:t>
+      </w:r>
+      <w:r>
+        <w:t xml:space="preserve">(SAE International, 2021). The SAE on-road automation standard grades vehicle systems from no automation (L0) through full driving automation (L5) by reference to who is responsible for the dynamic driving task and under what conditions. The PRS borrows the</w:t>
       </w:r>
       <w:r>
         <w:t xml:space="preserve"> </w:t>
@@ -6087,13 +6087,13 @@
           <w:b/>
           <w:bCs/>
         </w:rPr>
-        <w:t xml:space="preserve">NIST AI Risk Management Framework (AI RMF 1.0, 2023).</w:t>
-      </w:r>
-      <w:r>
-        <w:t xml:space="preserve"> </w:t>
-      </w:r>
-      <w:r>
-        <w:t xml:space="preserve">NIST's AI RMF is a</w:t>
+        <w:t xml:space="preserve">NIST AI Risk Management Framework (AI RMF 1.0)</w:t>
+      </w:r>
+      <w:r>
+        <w:t xml:space="preserve"> </w:t>
+      </w:r>
+      <w:r>
+        <w:t xml:space="preserve">(National Institute of Standards and Technology, 2023). NIST's AI RMF is a</w:t>
       </w:r>
       <w:r>
         <w:t xml:space="preserve"> </w:t>
@@ -6394,7 +6394,7 @@
         <w:t xml:space="preserve"> </w:t>
       </w:r>
       <w:r>
-        <w:t xml:space="preserve">is the psychometric tradition (Messick's, 1989, modern construct-validity framework).</w:t>
+        <w:t xml:space="preserve">is the psychometric tradition, drawing on Messick's (1989) modern construct-validity framework.</w:t>
       </w:r>
       <w:r>
         <w:t xml:space="preserve"> </w:t>
@@ -7590,7 +7590,7 @@
         <w:pStyle w:val="BodyText"/>
       </w:pPr>
       <w:r>
-        <w:t xml:space="preserve">Workplace-oriented operational articulations of the same commitment include Cathy Moore's Action Mapping (introduced on her practitioner blog c. 2008 and consolidated in</w:t>
+        <w:t xml:space="preserve">Workplace-oriented operational articulations of the same commitment include Cathy Moore's Action Mapping, introduced on her practitioner blog c. 2008 and consolidated in</w:t>
       </w:r>
       <w:r>
         <w:t xml:space="preserve"> </w:t>
@@ -7603,15 +7603,18 @@
         <w:t xml:space="preserve">Map It</w:t>
       </w:r>
       <w:r>
-        <w:t xml:space="preserve">, 2017), which insists on backward design from business performance goals; Conrad Gottfredson and Bob Mosher's 5 Moments of Need (2011), which draws the line between formal learning (the New and More moments) and performance support (Apply, Solve, Change) and locates the bulk of workplace skill acquisition outside formal training; Allison Rossett and Lisa Schafer's performance-support taxonomy (Planners, Advisors, Coaches, Sidekicks, 2007) which named the categories of in-workflow help that AR-overlay tooling now operates; and Robert Brinkerhoff's Success Case Method (2003), which provided the methodology for tracing whether an intervention actually moved performance for the workers who used it.</w:t>
-      </w:r>
-    </w:p>
-    <w:p>
-      <w:pPr>
-        <w:pStyle w:val="BodyText"/>
-      </w:pPr>
-      <w:r>
-        <w:t xml:space="preserve">The Kirkpatrick L1–L4 vocabulary (1959, updated 2016) is the dialect every reviewer of AAFL will use; AAFL adopts the vocabulary natively</w:t>
+        <w:t xml:space="preserve"> </w:t>
+      </w:r>
+      <w:r>
+        <w:t xml:space="preserve">(Moore, 2017), which insists on backward design from business performance goals; Conrad Gottfredson and Bob Mosher's 5 Moments of Need (Gottfredson &amp; Mosher, 2011), which draws the line between formal learning (the New and More moments) and performance support (Apply, Solve, Change) and locates the bulk of workplace skill acquisition outside formal training; Allison Rossett and Lisa Schafer's performance-support taxonomy of Planners, Advisors, Coaches, and Sidekicks (Rossett &amp; Schafer, 2007), which named the categories of in-workflow help that AR-overlay tooling now operates; and Robert Brinkerhoff's Success Case Method (Brinkerhoff, 2003), which provided the methodology for tracing whether an intervention actually moved performance for the workers who used it.</w:t>
+      </w:r>
+    </w:p>
+    <w:p>
+      <w:pPr>
+        <w:pStyle w:val="BodyText"/>
+      </w:pPr>
+      <w:r>
+        <w:t xml:space="preserve">The Kirkpatrick L1–L4 vocabulary (Kirkpatrick &amp; Kirkpatrick, 2016; originally articulated by Donald Kirkpatrick in 1959) is the dialect every reviewer of AAFL will use; AAFL adopts the vocabulary natively</w:t>
       </w:r>
       <w:r>
         <w:t xml:space="preserve"> </w:t>
@@ -7788,7 +7791,7 @@
         <w:t xml:space="preserve"> </w:t>
       </w:r>
       <w:r>
-        <w:t xml:space="preserve">(Allen with Sites, 2012). AAFL inherits SAM's iterative discipline. The Translator's Loop is functionally similar to SAM's rapid-prototyping cycle, applied at per-artifact granularity rather than per-course granularity.</w:t>
+        <w:t xml:space="preserve">(Allen &amp; Sites, 2012). AAFL inherits SAM's iterative discipline. The Translator's Loop is functionally similar to SAM's rapid-prototyping cycle, applied at per-artifact granularity rather than per-course granularity.</w:t>
       </w:r>
     </w:p>
     <w:bookmarkEnd w:id="71"/>
@@ -7840,7 +7843,7 @@
         <w:t xml:space="preserve"> </w:t>
       </w:r>
       <w:r>
-        <w:t xml:space="preserve">(1985, 4th ed.; original 1965) provides the cognitive-architecture grounding for the conditions under which different categories of learning outcome can be reliably produced. AAFL's Gate 3 (Pedagogical Strategy) is the framework's structural commitment to asking</w:t>
+        <w:t xml:space="preserve">(Gagné, 1985; 4th ed., original 1965) provides the cognitive-architecture grounding for the conditions under which different categories of learning outcome can be reliably produced. AAFL's Gate 3 (Pedagogical Strategy) is the framework's structural commitment to asking</w:t>
       </w:r>
       <w:r>
         <w:t xml:space="preserve"> </w:t>
@@ -7885,7 +7888,7 @@
         <w:t xml:space="preserve"> </w:t>
       </w:r>
       <w:r>
-        <w:t xml:space="preserve">(2014, 8th ed.; original 1978) is the canonical systematic-design textbook against which any ADDIE-extension framework will be read; AAFL inherits its commitment to backward-mapped objectives and criterion-referenced assessment, both operationalized at Gate 2 (Performance Outcome) and Gate 6 (Assessment Validity). Smith and Ragan's</w:t>
+        <w:t xml:space="preserve">(Dick et al., 2014; 8th ed., original 1978) is the canonical systematic-design textbook against which any ADDIE-extension framework will be read; AAFL inherits its commitment to backward-mapped objectives and criterion-referenced assessment, both operationalized at Gate 2 (Performance Outcome) and Gate 6 (Assessment Validity). Smith and Ragan's</w:t>
       </w:r>
       <w:r>
         <w:t xml:space="preserve"> </w:t>
@@ -7901,7 +7904,7 @@
         <w:t xml:space="preserve"> </w:t>
       </w:r>
       <w:r>
-        <w:t xml:space="preserve">(2005) is the parallel ID-textbook anchor that any reviewer trained outside the Dick-Carey tradition will read AAFL against; the framework's commitments are consistent with both lineages.</w:t>
+        <w:t xml:space="preserve">(Smith &amp; Ragan, 2005) is the parallel ID-textbook anchor that any reviewer trained outside the Dick-Carey tradition will read AAFL against; the framework's commitments are consistent with both lineages.</w:t>
       </w:r>
     </w:p>
     <w:p>
@@ -7919,7 +7922,7 @@
         <w:t xml:space="preserve"> </w:t>
       </w:r>
       <w:r>
-        <w:t xml:space="preserve">(2002,</w:t>
+        <w:t xml:space="preserve">(Merrill, 2002), published in</w:t>
       </w:r>
       <w:r>
         <w:t xml:space="preserve"> </w:t>
@@ -7932,7 +7935,7 @@
         <w:t xml:space="preserve">Educational Technology Research and Development</w:t>
       </w:r>
       <w:r>
-        <w:t xml:space="preserve">) consolidates the cross-theoretic instructional principles (task-centeredness, activation of prior knowledge, demonstration, application, integration) that AAFL's pedagogical gates assume without restating. A practitioner who passes Gate 3 with a strategy that violates Merrill's principles has produced a pedagogically thin design; the framework does not relitigate Merrill, it operates on top of him.</w:t>
+        <w:t xml:space="preserve">, consolidates the cross-theoretic instructional principles (task-centeredness, activation of prior knowledge, demonstration, application, integration) that AAFL's pedagogical gates assume without restating. A practitioner who passes Gate 3 with a strategy that violates Merrill's principles has produced a pedagogically thin design; the framework does not relitigate Merrill, it operates on top of him.</w:t>
       </w:r>
     </w:p>
     <w:p>
@@ -7966,7 +7969,7 @@
         <w:t xml:space="preserve"> </w:t>
       </w:r>
       <w:r>
-        <w:t xml:space="preserve">(1999, 2009, 2017) catalogs the theoretical pluralism within which AAFL is one operating choice. AAFL takes an explicitly</w:t>
+        <w:t xml:space="preserve">series (Reigeluth, 1999, and subsequent volumes co-edited with Carr-Chellman in 2009 and with Beatty and Myers in 2017) catalogs the theoretical pluralism within which AAFL is one operating choice. AAFL takes an explicitly</w:t>
       </w:r>
       <w:r>
         <w:t xml:space="preserve"> </w:t>
@@ -8086,7 +8089,7 @@
         <w:t xml:space="preserve"> </w:t>
       </w:r>
       <w:r>
-        <w:t xml:space="preserve">(Hardman, 2025b). FRAME maps capability risk; AAFL maps decision authority. FRAME tells you</w:t>
+        <w:t xml:space="preserve">(Hardman, 2025). FRAME maps capability risk; AAFL maps decision authority. FRAME tells you</w:t>
       </w:r>
       <w:r>
         <w:t xml:space="preserve"> </w:t>
@@ -8115,7 +8118,7 @@
         <w:t xml:space="preserve"> </w:t>
       </w:r>
       <w:r>
-        <w:t xml:space="preserve">The frameworks are complementary, not competing; citing FRAME strengthens AAFL's positioning. Hardman's "danger zone" framing in the jagged-frontier work (Hardman, 2025b) is the closest published precursor to AAFL's pedagogical-vs-production task split.</w:t>
+        <w:t xml:space="preserve">The frameworks are complementary, not competing; citing FRAME strengthens AAFL's positioning. Hardman's "danger zone" framing in the jagged-frontier work (Hardman, 2025) is the closest published precursor to AAFL's pedagogical-vs-production task split.</w:t>
       </w:r>
     </w:p>
     <w:p>
@@ -8316,7 +8319,7 @@
         <w:t xml:space="preserve"> </w:t>
       </w:r>
       <w:r>
-        <w:t xml:space="preserve">(Anthropic Engineering, 2026; Liang et al., 2023, Stanford HELM; EleutherAI lm-evaluation-harness, 2024). Source of the technical discipline borrowed for the Evaluation-as-Spec Layer. The discipline is vendor-neutral and well-established in the broader LLM-evaluation literature; Anthropic Engineering's articulation is the cleanest practitioner-facing version cited here, and Stanford HELM and the EleutherAI harness are named to make the non-vendor lineage visible. AAFL's eval-as-spec stance does not depend on any specific vendor's tooling.</w:t>
+        <w:t xml:space="preserve">(Anthropic Engineering, 2026; Liang et al., 2023; EleutherAI, 2024). Source of the technical discipline borrowed for the Evaluation-as-Spec Layer. The discipline is vendor-neutral and well-established in the broader LLM-evaluation literature; Anthropic Engineering's articulation is the cleanest practitioner-facing version cited here, and Stanford's HELM benchmark (Liang et al., 2023) and EleutherAI's lm-evaluation-harness (EleutherAI, 2024) are named to make the non-vendor lineage visible. AAFL's eval-as-spec stance does not depend on any specific vendor's tooling.</w:t>
       </w:r>
     </w:p>
     <w:p>
@@ -8334,7 +8337,7 @@
         <w:t xml:space="preserve"> </w:t>
       </w:r>
       <w:r>
-        <w:t xml:space="preserve">(Saghafian &amp; Idan, 2024,</w:t>
+        <w:t xml:space="preserve">(Saghafian &amp; Idan, 2024). Hybrid human-algorithm symbiosis pattern, articulated in</w:t>
       </w:r>
       <w:r>
         <w:t xml:space="preserve"> </w:t>
@@ -8347,7 +8350,7 @@
         <w:t xml:space="preserve">Harvard Data Science Review</w:t>
       </w:r>
       <w:r>
-        <w:t xml:space="preserve">). Hybrid human-algorithm symbiosis pattern. The Translator's Loop is functionally a centaur cycle applied to instructional artifact production.</w:t>
+        <w:t xml:space="preserve">. The Translator's Loop is functionally a centaur cycle applied to instructional artifact production.</w:t>
       </w:r>
     </w:p>
     <w:p>
@@ -8465,7 +8468,7 @@
         <w:t xml:space="preserve"> </w:t>
       </w:r>
       <w:r>
-        <w:t xml:space="preserve">(Brynjolfsson, Li, &amp; Raymond, 2025): the most-cited empirical study of generative-AI productivity effects in a customer-support setting, establishing the productivity-impact range that the §6 PRS-1/PRS-2 bands are anchored against.</w:t>
+        <w:t xml:space="preserve">(Brynjolfsson et al., 2025): the most-cited empirical study of generative-AI productivity effects in a customer-support setting, establishing the productivity-impact range that the §6 PRS-1/PRS-2 bands are anchored against.</w:t>
       </w:r>
       <w:r>
         <w:t xml:space="preserve"> </w:t>
@@ -8546,7 +8549,7 @@
         <w:t xml:space="preserve"> </w:t>
       </w:r>
       <w:r>
-        <w:t xml:space="preserve">(2019, Polity) raises the deskilling concern: that delegating authorship to AI agents hollows out the practitioner profession over time, leaving humans only the credentialing-and-rubber-stamping residue of work the agent now drafts. AAFL's structural response is the four pedagogical gates: Learner Reality, Performance Outcome, Pedagogical Strategy, and Performance-Effect are</w:t>
+        <w:t xml:space="preserve">(Selwyn, 2019) raises the deskilling concern: that delegating authorship to AI agents hollows out the practitioner profession over time, leaving humans only the credentialing-and-rubber-stamping residue of work the agent now drafts. AAFL's structural response is the four pedagogical gates: Learner Reality, Performance Outcome, Pedagogical Strategy, and Performance-Effect are</w:t>
       </w:r>
       <w:r>
         <w:t xml:space="preserve"> </w:t>
@@ -8593,7 +8596,7 @@
         <w:t xml:space="preserve"> </w:t>
       </w:r>
       <w:r>
-        <w:t xml:space="preserve">(2017, SAGE) raises the surveillance and data-political concerns inherent in learner analytics, adaptive systems, and per-learner content variation: exactly the territory PRS-3 and PRS-4 operate in. AAFL's Governance Layer (§8) and classification-aware caps (§10) are partly a structural response: audit trail, classification handling, escalation paths, and named-accountable-human signatures are the institutional infrastructure that prevents AAFL implementations from becoming the surveillance-and-optimization regimes Williamson describes. Williamson's deeper concern — that datafication itself reshapes what counts as learning — is not fully resolvable inside any operating framework. AAFL's narrower response is that workplace-performance signals (time-to-competency, error-rate change, transfer-to-job) are</w:t>
+        <w:t xml:space="preserve">(Williamson, 2017) raises the surveillance and data-political concerns inherent in learner analytics, adaptive systems, and per-learner content variation: exactly the territory PRS-3 and PRS-4 operate in. AAFL's Governance Layer (§8) and classification-aware caps (§10) are partly a structural response: audit trail, classification handling, escalation paths, and named-accountable-human signatures are the institutional infrastructure that prevents AAFL implementations from becoming the surveillance-and-optimization regimes Williamson describes. Williamson's deeper concern — that datafication itself reshapes what counts as learning — is not fully resolvable inside any operating framework. AAFL's narrower response is that workplace-performance signals (time-to-competency, error-rate change, transfer-to-job) are</w:t>
       </w:r>
       <w:r>
         <w:t xml:space="preserve"> </w:t>
@@ -8675,7 +8678,7 @@
         <w:t xml:space="preserve"> </w:t>
       </w:r>
       <w:r>
-        <w:t xml:space="preserve">(2019, Center for Curriculum Redesign) is the most-cited recent overview of AI's promises and implications for teaching and learning; AAFL inherits its commitment to taking both the affordances and the risks seriously, and its emphasis on educator agency in the face of vendor-driven adoption pressure. Holmes, Bialik, and Fadel offer a tripartite distinction between learning</w:t>
+        <w:t xml:space="preserve">(Holmes et al., 2019) is the most-cited recent overview of AI's promises and implications for teaching and learning; AAFL inherits its commitment to taking both the affordances and the risks seriously, and its emphasis on educator agency in the face of vendor-driven adoption pressure. Holmes et al. offer a tripartite distinction between learning</w:t>
       </w:r>
       <w:r>
         <w:t xml:space="preserve"> </w:t>
@@ -8773,7 +8776,7 @@
         <w:t xml:space="preserve"> </w:t>
       </w:r>
       <w:r>
-        <w:t xml:space="preserve">(2018, UCL IOE Press) is the most-cited contemporary voice in the AIED-and-pedagogy intersection from the European center of this conversation. Luckin's distinction between</w:t>
+        <w:t xml:space="preserve">(Luckin, 2018) is the most-cited contemporary voice in the AIED-and-pedagogy intersection from the European center of this conversation. Luckin's distinction between</w:t>
       </w:r>
       <w:r>
         <w:t xml:space="preserve"> </w:t>
@@ -8902,7 +8905,7 @@
         <w:t xml:space="preserve"> </w:t>
       </w:r>
       <w:r>
-        <w:t xml:space="preserve">(2021, MIT Press) provides the historical context the contemporary AI-in-education discourse often omits: the dream of personalized algorithmic instruction is a century old, has been repeatedly oversold, and has repeatedly produced unintended consequences. AAFL's</w:t>
+        <w:t xml:space="preserve">(Watters, 2021) provides the historical context the contemporary AI-in-education discourse often omits: the dream of personalized algorithmic instruction is a century old, has been repeatedly oversold, and has repeatedly produced unintended consequences. AAFL's</w:t>
       </w:r>
       <w:r>
         <w:t xml:space="preserve"> </w:t>
@@ -10021,7 +10024,7 @@
         <w:pStyle w:val="FirstParagraph"/>
       </w:pPr>
       <w:r>
-        <w:t xml:space="preserve">Allen, M. W., with Sites, R. (2012).</w:t>
+        <w:t xml:space="preserve">Allen, M. W., &amp; Sites, R. (2012).</w:t>
       </w:r>
       <w:r>
         <w:t xml:space="preserve"> </w:t>
@@ -10122,7 +10125,7 @@
         <w:t xml:space="preserve"> </w:t>
       </w:r>
       <w:r>
-        <w:t xml:space="preserve">(arXiv:2604.16566).</w:t>
+        <w:t xml:space="preserve">[Preprint] (arXiv:2604.16566).</w:t>
       </w:r>
       <w:r>
         <w:t xml:space="preserve"> </w:t>
@@ -10534,27 +10537,6 @@
         <w:pStyle w:val="BodyText"/>
       </w:pPr>
       <w:r>
-        <w:t xml:space="preserve">Clark, D. (2025).</w:t>
-      </w:r>
-      <w:r>
-        <w:t xml:space="preserve"> </w:t>
-      </w:r>
-      <w:r>
-        <w:rPr>
-          <w:i/>
-          <w:iCs/>
-        </w:rPr>
-        <w:t xml:space="preserve">Learning experience design: How to create effective learning that works</w:t>
-      </w:r>
-      <w:r>
-        <w:t xml:space="preserve">. Kogan Page.</w:t>
-      </w:r>
-    </w:p>
-    <w:p>
-      <w:pPr>
-        <w:pStyle w:val="BodyText"/>
-      </w:pPr>
-      <w:r>
         <w:t xml:space="preserve">Dakan, R., &amp; Feller, J. (2023–2025).</w:t>
       </w:r>
       <w:r>
@@ -12064,7 +12046,7 @@
         <w:t xml:space="preserve"> </w:t>
       </w:r>
       <w:r>
-        <w:t xml:space="preserve">(arXiv:2504.05370).</w:t>
+        <w:t xml:space="preserve">[Preprint] (arXiv:2504.05370).</w:t>
       </w:r>
       <w:r>
         <w:t xml:space="preserve"> </w:t>

</xml_diff>

<commit_message>
Wire Zenodo DOIs into CITATION.cff, README, and manuscript
Zenodo minted concept + version DOIs after v1.3 GitHub release:
- Concept DOI (always-latest): 10.5281/zenodo.20319475
- Version DOI (v1.3 frozen):   10.5281/zenodo.20319476

Updates:
- CITATION.cff: top-level doi + identifiers block with both DOIs
- README.md: live DOI badge (concept) + frozen-version link, citation block
- Manuscript suggested citation: Zenodo with concept DOI as primary
- Rebuilt HTML, PDF, DOCX

Co-Authored-By: Claude Opus 4.7 (1M context) <noreply@anthropic.com>
</commit_message>
<xml_diff>
--- a/whitepaper/aafl-whitepaper-v1.3.docx
+++ b/whitepaper/aafl-whitepaper-v1.3.docx
@@ -60,7 +60,7 @@
         </w:p>
       </w:sdtContent>
     </w:sdt>
-    <w:bookmarkStart w:id="139" w:name="Xf3c2d715b34d24641f34b2f9fb07d3430610d0d"/>
+    <w:bookmarkStart w:id="141" w:name="Xf3c2d715b34d24641f34b2f9fb07d3430610d0d"/>
     <w:p>
       <w:pPr>
         <w:pStyle w:val="Heading1"/>
@@ -9266,7 +9266,7 @@
     </w:p>
     <w:bookmarkEnd w:id="82"/>
     <w:bookmarkEnd w:id="83"/>
-    <w:bookmarkStart w:id="92" w:name="X152f04f5f2eff916bc4a2ba4f9d7af6d15e0910"/>
+    <w:bookmarkStart w:id="94" w:name="X152f04f5f2eff916bc4a2ba4f9d7af6d15e0910"/>
     <w:p>
       <w:pPr>
         <w:pStyle w:val="Heading2"/>
@@ -9564,7 +9564,7 @@
       </w:r>
     </w:p>
     <w:bookmarkEnd w:id="89"/>
-    <w:bookmarkStart w:id="91" w:name="ip-and-authorship"/>
+    <w:bookmarkStart w:id="93" w:name="ip-and-authorship"/>
     <w:p>
       <w:pPr>
         <w:pStyle w:val="Heading3"/>
@@ -9588,18 +9588,43 @@
           <w:i/>
           <w:iCs/>
         </w:rPr>
-        <w:t xml:space="preserve">Bakshi, R. (2026). AAFL: An Agent-Augmented Framework for Learning (v1.3). instructionalai.org.</w:t>
-      </w:r>
-      <w:r>
-        <w:t xml:space="preserve"> </w:t>
-      </w:r>
-      <w:r>
-        <w:t xml:space="preserve">© Ruchir Bakshi 2026. Licensed under Creative Commons Attribution-NonCommercial 4.0 International (CC BY-NC 4.0):</w:t>
+        <w:t xml:space="preserve">Bakshi, R. (2026). AAFL: An Agent-Augmented Framework for Learning (v1.3). Zenodo.</w:t>
       </w:r>
       <w:r>
         <w:t xml:space="preserve"> </w:t>
       </w:r>
       <w:hyperlink r:id="rId90">
+        <w:r>
+          <w:rPr>
+            <w:rStyle w:val="Hyperlink"/>
+          </w:rPr>
+          <w:t xml:space="preserve">https://doi.org/10.5281/zenodo.20319475</w:t>
+        </w:r>
+      </w:hyperlink>
+      <w:r>
+        <w:t xml:space="preserve"> </w:t>
+      </w:r>
+      <w:r>
+        <w:t xml:space="preserve">(concept DOI — always-latest; v1.3 frozen at</w:t>
+      </w:r>
+      <w:r>
+        <w:t xml:space="preserve"> </w:t>
+      </w:r>
+      <w:hyperlink r:id="rId91">
+        <w:r>
+          <w:rPr>
+            <w:rStyle w:val="Hyperlink"/>
+          </w:rPr>
+          <w:t xml:space="preserve">https://doi.org/10.5281/zenodo.20319476</w:t>
+        </w:r>
+      </w:hyperlink>
+      <w:r>
+        <w:t xml:space="preserve">). © Ruchir Bakshi 2026. Licensed under Creative Commons Attribution-NonCommercial 4.0 International (CC BY-NC 4.0):</w:t>
+      </w:r>
+      <w:r>
+        <w:t xml:space="preserve"> </w:t>
+      </w:r>
+      <w:hyperlink r:id="rId92">
         <w:r>
           <w:rPr>
             <w:rStyle w:val="Hyperlink"/>
@@ -9631,9 +9656,9 @@
         </w:pict>
       </w:r>
     </w:p>
-    <w:bookmarkEnd w:id="91"/>
-    <w:bookmarkEnd w:id="92"/>
-    <w:bookmarkStart w:id="95" w:name="X70d40b95530a814cb670cfd0d4b6e47a9d354d4"/>
+    <w:bookmarkEnd w:id="93"/>
+    <w:bookmarkEnd w:id="94"/>
+    <w:bookmarkStart w:id="97" w:name="X70d40b95530a814cb670cfd0d4b6e47a9d354d4"/>
     <w:p>
       <w:pPr>
         <w:pStyle w:val="Heading2"/>
@@ -9650,7 +9675,7 @@
         <w:t xml:space="preserve">A framework that publishes its own caps owes the reader an account of its own limits. AAFL is a publishing-ready spec, not a validated artifact, and the gap between the two should be visible to anyone deciding whether to adopt it.</w:t>
       </w:r>
     </w:p>
-    <w:bookmarkStart w:id="93" w:name="limitations"/>
+    <w:bookmarkStart w:id="95" w:name="limitations"/>
     <w:p>
       <w:pPr>
         <w:pStyle w:val="Heading3"/>
@@ -9878,8 +9903,8 @@
         <w:t xml:space="preserve">This is a scope choice, not a defect, but readers from the non-instrumentalist tradition in education (Bayne et al., 2020) will rightly observe that not all educational contexts are appropriately measured against performance outcomes. AAFL's scope claim is that workplace-performance contexts are the right home for instrumental measurement (people are paying for training to get better at their work); the framework takes no position on the non-workplace contexts where Bayne et al.'s critique applies. The non-instrumentalist tradition's deeper point — that teaching is constitutively relational and that reducing it to optimization targets is a category error in some contexts — is acknowledged as a limit on AAFL's scope, not as a critique the framework dissolves.</w:t>
       </w:r>
     </w:p>
-    <w:bookmarkEnd w:id="93"/>
-    <w:bookmarkStart w:id="94" w:name="future-work"/>
+    <w:bookmarkEnd w:id="95"/>
+    <w:bookmarkStart w:id="96" w:name="future-work"/>
     <w:p>
       <w:pPr>
         <w:pStyle w:val="Heading3"/>
@@ -10008,9 +10033,9 @@
         </w:pict>
       </w:r>
     </w:p>
-    <w:bookmarkEnd w:id="94"/>
-    <w:bookmarkEnd w:id="95"/>
-    <w:bookmarkStart w:id="132" w:name="Xa965afcbae169b28f77540e68fff4c8d3a6ae6b"/>
+    <w:bookmarkEnd w:id="96"/>
+    <w:bookmarkEnd w:id="97"/>
+    <w:bookmarkStart w:id="134" w:name="Xa965afcbae169b28f77540e68fff4c8d3a6ae6b"/>
     <w:p>
       <w:pPr>
         <w:pStyle w:val="Heading2"/>
@@ -10063,7 +10088,7 @@
       <w:r>
         <w:t xml:space="preserve"> </w:t>
       </w:r>
-      <w:hyperlink r:id="rId96">
+      <w:hyperlink r:id="rId98">
         <w:r>
           <w:rPr>
             <w:rStyle w:val="Hyperlink"/>
@@ -10095,7 +10120,7 @@
       <w:r>
         <w:t xml:space="preserve"> </w:t>
       </w:r>
-      <w:hyperlink r:id="rId97">
+      <w:hyperlink r:id="rId99">
         <w:r>
           <w:rPr>
             <w:rStyle w:val="Hyperlink"/>
@@ -10130,7 +10155,7 @@
       <w:r>
         <w:t xml:space="preserve"> </w:t>
       </w:r>
-      <w:hyperlink r:id="rId98">
+      <w:hyperlink r:id="rId100">
         <w:r>
           <w:rPr>
             <w:rStyle w:val="Hyperlink"/>
@@ -10172,7 +10197,7 @@
       <w:r>
         <w:t xml:space="preserve"> </w:t>
       </w:r>
-      <w:hyperlink r:id="rId99">
+      <w:hyperlink r:id="rId101">
         <w:r>
           <w:rPr>
             <w:rStyle w:val="Hyperlink"/>
@@ -10217,7 +10242,7 @@
       <w:r>
         <w:t xml:space="preserve"> </w:t>
       </w:r>
-      <w:hyperlink r:id="rId100">
+      <w:hyperlink r:id="rId102">
         <w:r>
           <w:rPr>
             <w:rStyle w:val="Hyperlink"/>
@@ -10273,7 +10298,7 @@
       <w:r>
         <w:t xml:space="preserve"> </w:t>
       </w:r>
-      <w:hyperlink r:id="rId101">
+      <w:hyperlink r:id="rId103">
         <w:r>
           <w:rPr>
             <w:rStyle w:val="Hyperlink"/>
@@ -10318,7 +10343,7 @@
       <w:r>
         <w:t xml:space="preserve"> </w:t>
       </w:r>
-      <w:hyperlink r:id="rId102">
+      <w:hyperlink r:id="rId104">
         <w:r>
           <w:rPr>
             <w:rStyle w:val="Hyperlink"/>
@@ -10398,7 +10423,7 @@
       <w:r>
         <w:t xml:space="preserve"> </w:t>
       </w:r>
-      <w:hyperlink r:id="rId103">
+      <w:hyperlink r:id="rId105">
         <w:r>
           <w:rPr>
             <w:rStyle w:val="Hyperlink"/>
@@ -10459,7 +10484,7 @@
       <w:r>
         <w:t xml:space="preserve"> </w:t>
       </w:r>
-      <w:hyperlink r:id="rId104">
+      <w:hyperlink r:id="rId106">
         <w:r>
           <w:rPr>
             <w:rStyle w:val="Hyperlink"/>
@@ -10491,7 +10516,7 @@
       <w:r>
         <w:t xml:space="preserve"> </w:t>
       </w:r>
-      <w:hyperlink r:id="rId105">
+      <w:hyperlink r:id="rId107">
         <w:r>
           <w:rPr>
             <w:rStyle w:val="Hyperlink"/>
@@ -10523,7 +10548,7 @@
       <w:r>
         <w:t xml:space="preserve"> </w:t>
       </w:r>
-      <w:hyperlink r:id="rId106">
+      <w:hyperlink r:id="rId108">
         <w:r>
           <w:rPr>
             <w:rStyle w:val="Hyperlink"/>
@@ -10555,7 +10580,7 @@
       <w:r>
         <w:t xml:space="preserve"> </w:t>
       </w:r>
-      <w:hyperlink r:id="rId107">
+      <w:hyperlink r:id="rId109">
         <w:r>
           <w:rPr>
             <w:rStyle w:val="Hyperlink"/>
@@ -10632,7 +10657,7 @@
       <w:r>
         <w:t xml:space="preserve"> </w:t>
       </w:r>
-      <w:hyperlink r:id="rId108">
+      <w:hyperlink r:id="rId110">
         <w:r>
           <w:rPr>
             <w:rStyle w:val="Hyperlink"/>
@@ -10667,7 +10692,7 @@
       <w:r>
         <w:t xml:space="preserve"> </w:t>
       </w:r>
-      <w:hyperlink r:id="rId109">
+      <w:hyperlink r:id="rId111">
         <w:r>
           <w:rPr>
             <w:rStyle w:val="Hyperlink"/>
@@ -10786,7 +10811,7 @@
       <w:r>
         <w:t xml:space="preserve"> </w:t>
       </w:r>
-      <w:hyperlink r:id="rId110">
+      <w:hyperlink r:id="rId112">
         <w:r>
           <w:rPr>
             <w:rStyle w:val="Hyperlink"/>
@@ -10818,7 +10843,7 @@
       <w:r>
         <w:t xml:space="preserve"> </w:t>
       </w:r>
-      <w:hyperlink r:id="rId111">
+      <w:hyperlink r:id="rId113">
         <w:r>
           <w:rPr>
             <w:rStyle w:val="Hyperlink"/>
@@ -10919,7 +10944,7 @@
       <w:r>
         <w:t xml:space="preserve"> </w:t>
       </w:r>
-      <w:hyperlink r:id="rId112">
+      <w:hyperlink r:id="rId114">
         <w:r>
           <w:rPr>
             <w:rStyle w:val="Hyperlink"/>
@@ -10974,7 +10999,7 @@
       <w:r>
         <w:t xml:space="preserve"> </w:t>
       </w:r>
-      <w:hyperlink r:id="rId113">
+      <w:hyperlink r:id="rId115">
         <w:r>
           <w:rPr>
             <w:rStyle w:val="Hyperlink"/>
@@ -11040,7 +11065,7 @@
       <w:r>
         <w:t xml:space="preserve"> </w:t>
       </w:r>
-      <w:hyperlink r:id="rId114">
+      <w:hyperlink r:id="rId116">
         <w:r>
           <w:rPr>
             <w:rStyle w:val="Hyperlink"/>
@@ -11106,7 +11131,7 @@
       <w:r>
         <w:t xml:space="preserve"> </w:t>
       </w:r>
-      <w:hyperlink r:id="rId115">
+      <w:hyperlink r:id="rId117">
         <w:r>
           <w:rPr>
             <w:rStyle w:val="Hyperlink"/>
@@ -11138,7 +11163,7 @@
       <w:r>
         <w:t xml:space="preserve"> </w:t>
       </w:r>
-      <w:hyperlink r:id="rId116">
+      <w:hyperlink r:id="rId118">
         <w:r>
           <w:rPr>
             <w:rStyle w:val="Hyperlink"/>
@@ -11183,7 +11208,7 @@
       <w:r>
         <w:t xml:space="preserve"> </w:t>
       </w:r>
-      <w:hyperlink r:id="rId117">
+      <w:hyperlink r:id="rId119">
         <w:r>
           <w:rPr>
             <w:rStyle w:val="Hyperlink"/>
@@ -11260,7 +11285,7 @@
       <w:r>
         <w:t xml:space="preserve"> </w:t>
       </w:r>
-      <w:hyperlink r:id="rId118">
+      <w:hyperlink r:id="rId120">
         <w:r>
           <w:rPr>
             <w:rStyle w:val="Hyperlink"/>
@@ -11305,7 +11330,7 @@
       <w:r>
         <w:t xml:space="preserve"> </w:t>
       </w:r>
-      <w:hyperlink r:id="rId119">
+      <w:hyperlink r:id="rId121">
         <w:r>
           <w:rPr>
             <w:rStyle w:val="Hyperlink"/>
@@ -11374,7 +11399,7 @@
       <w:r>
         <w:t xml:space="preserve"> </w:t>
       </w:r>
-      <w:hyperlink r:id="rId120">
+      <w:hyperlink r:id="rId122">
         <w:r>
           <w:rPr>
             <w:rStyle w:val="Hyperlink"/>
@@ -11472,7 +11497,7 @@
       <w:r>
         <w:t xml:space="preserve"> </w:t>
       </w:r>
-      <w:hyperlink r:id="rId121">
+      <w:hyperlink r:id="rId123">
         <w:r>
           <w:rPr>
             <w:rStyle w:val="Hyperlink"/>
@@ -11517,7 +11542,7 @@
       <w:r>
         <w:t xml:space="preserve"> </w:t>
       </w:r>
-      <w:hyperlink r:id="rId122">
+      <w:hyperlink r:id="rId124">
         <w:r>
           <w:rPr>
             <w:rStyle w:val="Hyperlink"/>
@@ -11562,7 +11587,7 @@
       <w:r>
         <w:t xml:space="preserve"> </w:t>
       </w:r>
-      <w:hyperlink r:id="rId123">
+      <w:hyperlink r:id="rId125">
         <w:r>
           <w:rPr>
             <w:rStyle w:val="Hyperlink"/>
@@ -11597,7 +11622,7 @@
       <w:r>
         <w:t xml:space="preserve"> </w:t>
       </w:r>
-      <w:hyperlink r:id="rId124">
+      <w:hyperlink r:id="rId126">
         <w:r>
           <w:rPr>
             <w:rStyle w:val="Hyperlink"/>
@@ -11695,7 +11720,7 @@
       <w:r>
         <w:t xml:space="preserve"> </w:t>
       </w:r>
-      <w:hyperlink r:id="rId125">
+      <w:hyperlink r:id="rId127">
         <w:r>
           <w:rPr>
             <w:rStyle w:val="Hyperlink"/>
@@ -11727,7 +11752,7 @@
       <w:r>
         <w:t xml:space="preserve"> </w:t>
       </w:r>
-      <w:hyperlink r:id="rId126">
+      <w:hyperlink r:id="rId128">
         <w:r>
           <w:rPr>
             <w:rStyle w:val="Hyperlink"/>
@@ -11807,7 +11832,7 @@
       <w:r>
         <w:t xml:space="preserve"> </w:t>
       </w:r>
-      <w:hyperlink r:id="rId127">
+      <w:hyperlink r:id="rId129">
         <w:r>
           <w:rPr>
             <w:rStyle w:val="Hyperlink"/>
@@ -11852,7 +11877,7 @@
       <w:r>
         <w:t xml:space="preserve"> </w:t>
       </w:r>
-      <w:hyperlink r:id="rId128">
+      <w:hyperlink r:id="rId130">
         <w:r>
           <w:rPr>
             <w:rStyle w:val="Hyperlink"/>
@@ -11929,7 +11954,7 @@
       <w:r>
         <w:t xml:space="preserve"> </w:t>
       </w:r>
-      <w:hyperlink r:id="rId129">
+      <w:hyperlink r:id="rId131">
         <w:r>
           <w:rPr>
             <w:rStyle w:val="Hyperlink"/>
@@ -12016,7 +12041,7 @@
       <w:r>
         <w:t xml:space="preserve"> </w:t>
       </w:r>
-      <w:hyperlink r:id="rId130">
+      <w:hyperlink r:id="rId132">
         <w:r>
           <w:rPr>
             <w:rStyle w:val="Hyperlink"/>
@@ -12051,7 +12076,7 @@
       <w:r>
         <w:t xml:space="preserve"> </w:t>
       </w:r>
-      <w:hyperlink r:id="rId131">
+      <w:hyperlink r:id="rId133">
         <w:r>
           <w:rPr>
             <w:rStyle w:val="Hyperlink"/>
@@ -12067,8 +12092,8 @@
         </w:pict>
       </w:r>
     </w:p>
-    <w:bookmarkEnd w:id="132"/>
-    <w:bookmarkStart w:id="135" w:name="about-the-author"/>
+    <w:bookmarkEnd w:id="134"/>
+    <w:bookmarkStart w:id="137" w:name="about-the-author"/>
     <w:p>
       <w:pPr>
         <w:pStyle w:val="Heading2"/>
@@ -12097,7 +12122,7 @@
       <w:r>
         <w:t xml:space="preserve"> </w:t>
       </w:r>
-      <w:hyperlink r:id="rId133">
+      <w:hyperlink r:id="rId135">
         <w:r>
           <w:rPr>
             <w:rStyle w:val="Hyperlink"/>
@@ -12111,7 +12136,7 @@
       <w:r>
         <w:t xml:space="preserve"> </w:t>
       </w:r>
-      <w:hyperlink r:id="rId134">
+      <w:hyperlink r:id="rId136">
         <w:r>
           <w:rPr>
             <w:rStyle w:val="Hyperlink"/>
@@ -12136,7 +12161,7 @@
       <w:r>
         <w:t xml:space="preserve"> </w:t>
       </w:r>
-      <w:hyperlink r:id="rId90">
+      <w:hyperlink r:id="rId92">
         <w:r>
           <w:rPr>
             <w:rStyle w:val="Hyperlink"/>
@@ -12155,7 +12180,38 @@
           <w:i/>
           <w:iCs/>
         </w:rPr>
-        <w:t xml:space="preserve">Bakshi, R. (2026). AAFL: An Agent-Augmented Framework for Learning (v1.3). instructionalai.org.</w:t>
+        <w:t xml:space="preserve">Bakshi, R. (2026). AAFL: An Agent-Augmented Framework for Learning (v1.3). Zenodo.</w:t>
+      </w:r>
+      <w:r>
+        <w:t xml:space="preserve"> </w:t>
+      </w:r>
+      <w:hyperlink r:id="rId90">
+        <w:r>
+          <w:rPr>
+            <w:rStyle w:val="Hyperlink"/>
+          </w:rPr>
+          <w:t xml:space="preserve">https://doi.org/10.5281/zenodo.20319475</w:t>
+        </w:r>
+      </w:hyperlink>
+      <w:r>
+        <w:t xml:space="preserve"> </w:t>
+      </w:r>
+      <w:r>
+        <w:t xml:space="preserve">(concept DOI — always-latest; v1.3 frozen at</w:t>
+      </w:r>
+      <w:r>
+        <w:t xml:space="preserve"> </w:t>
+      </w:r>
+      <w:hyperlink r:id="rId91">
+        <w:r>
+          <w:rPr>
+            <w:rStyle w:val="Hyperlink"/>
+          </w:rPr>
+          <w:t xml:space="preserve">https://doi.org/10.5281/zenodo.20319476</w:t>
+        </w:r>
+      </w:hyperlink>
+      <w:r>
+        <w:t xml:space="preserve">).</w:t>
       </w:r>
     </w:p>
     <w:p>
@@ -12165,8 +12221,8 @@
         </w:pict>
       </w:r>
     </w:p>
-    <w:bookmarkEnd w:id="135"/>
-    <w:bookmarkStart w:id="136" w:name="appendix-a-acronym-glossary"/>
+    <w:bookmarkEnd w:id="137"/>
+    <w:bookmarkStart w:id="138" w:name="appendix-a-acronym-glossary"/>
     <w:p>
       <w:pPr>
         <w:pStyle w:val="Heading2"/>
@@ -13390,8 +13446,8 @@
         </w:pict>
       </w:r>
     </w:p>
-    <w:bookmarkEnd w:id="136"/>
-    <w:bookmarkStart w:id="138" w:name="X370634ec183ad269684185c9ef9e23d5bc61f86"/>
+    <w:bookmarkEnd w:id="138"/>
+    <w:bookmarkStart w:id="140" w:name="X370634ec183ad269684185c9ef9e23d5bc61f86"/>
     <w:p>
       <w:pPr>
         <w:pStyle w:val="Heading2"/>
@@ -14712,7 +14768,7 @@
         </w:tc>
       </w:tr>
     </w:tbl>
-    <w:bookmarkStart w:id="137" w:name="reading-the-scan"/>
+    <w:bookmarkStart w:id="139" w:name="reading-the-scan"/>
     <w:p>
       <w:pPr>
         <w:pStyle w:val="Heading3"/>
@@ -14861,9 +14917,9 @@
         </w:pict>
       </w:r>
     </w:p>
-    <w:bookmarkEnd w:id="137"/>
-    <w:bookmarkEnd w:id="138"/>
     <w:bookmarkEnd w:id="139"/>
+    <w:bookmarkEnd w:id="140"/>
+    <w:bookmarkEnd w:id="141"/>
     <w:sectPr>
       <w:footnotePr>
         <w:numRestart w:val="eachSect"/>

</xml_diff>

<commit_message>
v1.3.1 — Zenodo deposit cleanup (remove v1.2 artifacts)
The v1.3 Zenodo deposit had inadvertently archived v1.2 artifacts
alongside v1.3 under different licenses (v1.2 proprietary, v1.3
CC BY-NC 4.0), creating license ambiguity and reader confusion.

No content changes — version metadata and CHANGELOG only.

- Remove whitepaper/aafl-whitepaper-v1.2.{md,html,docx,pdf}
- Remove superseded build.py and build-docx.py (v1.2 targets)
- Bump version metadata to v1.3.1 (2026-05-21) in manuscript,
  CITATION.cff, README, CHANGELOG
- Concept DOI (10.5281/zenodo.20319475) unchanged
- v1.3 version DOI (10.5281/zenodo.20319476) remains permanently citable

Co-Authored-By: Claude Opus 4.7 (1M context) <noreply@anthropic.com>
</commit_message>
<xml_diff>
--- a/whitepaper/aafl-whitepaper-v1.3.docx
+++ b/whitepaper/aafl-whitepaper-v1.3.docx
@@ -31,7 +31,7 @@
         <w:pStyle w:val="Date"/>
       </w:pPr>
       <w:r>
-        <w:t xml:space="preserve">2026-05-20</w:t>
+        <w:t xml:space="preserve">2026-05-21</w:t>
       </w:r>
     </w:p>
     <w:sdt>
@@ -60,7 +60,7 @@
         </w:p>
       </w:sdtContent>
     </w:sdt>
-    <w:bookmarkStart w:id="141" w:name="Xf3c2d715b34d24641f34b2f9fb07d3430610d0d"/>
+    <w:bookmarkStart w:id="140" w:name="Xf3c2d715b34d24641f34b2f9fb07d3430610d0d"/>
     <w:p>
       <w:pPr>
         <w:pStyle w:val="Heading1"/>
@@ -96,7 +96,7 @@
         <w:t xml:space="preserve"> </w:t>
       </w:r>
       <w:r>
-        <w:t xml:space="preserve">· v1.3 · 2026-05-20</w:t>
+        <w:t xml:space="preserve">· v1.3.1 · 2026-05-21</w:t>
       </w:r>
     </w:p>
     <w:p>
@@ -128,7 +128,7 @@
         <w:pStyle w:val="BodyText"/>
       </w:pPr>
       <w:r>
-        <w:t xml:space="preserve">This is v1.3 (2026-05-20).</w:t>
+        <w:t xml:space="preserve">This is v1.3.1 (2026-05-21) — a repository-cleanup patch over v1.3 (2026-05-20). No content changes. The v1.2 artifacts that were carried inside the v1.3 deposit have been removed so the Zenodo archive contains v1.3 forward only.</w:t>
       </w:r>
     </w:p>
     <w:p>
@@ -9266,7 +9266,7 @@
     </w:p>
     <w:bookmarkEnd w:id="82"/>
     <w:bookmarkEnd w:id="83"/>
-    <w:bookmarkStart w:id="94" w:name="X152f04f5f2eff916bc4a2ba4f9d7af6d15e0910"/>
+    <w:bookmarkStart w:id="93" w:name="X152f04f5f2eff916bc4a2ba4f9d7af6d15e0910"/>
     <w:p>
       <w:pPr>
         <w:pStyle w:val="Heading2"/>
@@ -9564,7 +9564,7 @@
       </w:r>
     </w:p>
     <w:bookmarkEnd w:id="89"/>
-    <w:bookmarkStart w:id="93" w:name="ip-and-authorship"/>
+    <w:bookmarkStart w:id="92" w:name="ip-and-authorship"/>
     <w:p>
       <w:pPr>
         <w:pStyle w:val="Heading3"/>
@@ -9588,7 +9588,7 @@
           <w:i/>
           <w:iCs/>
         </w:rPr>
-        <w:t xml:space="preserve">Bakshi, R. (2026). AAFL: An Agent-Augmented Framework for Learning (v1.3). Zenodo.</w:t>
+        <w:t xml:space="preserve">Bakshi, R. (2026). AAFL: An Agent-Augmented Framework for Learning (v1.3.1). Zenodo.</w:t>
       </w:r>
       <w:r>
         <w:t xml:space="preserve"> </w:t>
@@ -9605,26 +9605,12 @@
         <w:t xml:space="preserve"> </w:t>
       </w:r>
       <w:r>
-        <w:t xml:space="preserve">(concept DOI — always-latest; v1.3 frozen at</w:t>
+        <w:t xml:space="preserve">(concept DOI — always-latest). © Ruchir Bakshi 2026. Licensed under Creative Commons Attribution-NonCommercial 4.0 International (CC BY-NC 4.0):</w:t>
       </w:r>
       <w:r>
         <w:t xml:space="preserve"> </w:t>
       </w:r>
       <w:hyperlink r:id="rId91">
-        <w:r>
-          <w:rPr>
-            <w:rStyle w:val="Hyperlink"/>
-          </w:rPr>
-          <w:t xml:space="preserve">https://doi.org/10.5281/zenodo.20319476</w:t>
-        </w:r>
-      </w:hyperlink>
-      <w:r>
-        <w:t xml:space="preserve">). © Ruchir Bakshi 2026. Licensed under Creative Commons Attribution-NonCommercial 4.0 International (CC BY-NC 4.0):</w:t>
-      </w:r>
-      <w:r>
-        <w:t xml:space="preserve"> </w:t>
-      </w:r>
-      <w:hyperlink r:id="rId92">
         <w:r>
           <w:rPr>
             <w:rStyle w:val="Hyperlink"/>
@@ -9656,9 +9642,9 @@
         </w:pict>
       </w:r>
     </w:p>
+    <w:bookmarkEnd w:id="92"/>
     <w:bookmarkEnd w:id="93"/>
-    <w:bookmarkEnd w:id="94"/>
-    <w:bookmarkStart w:id="97" w:name="X70d40b95530a814cb670cfd0d4b6e47a9d354d4"/>
+    <w:bookmarkStart w:id="96" w:name="X70d40b95530a814cb670cfd0d4b6e47a9d354d4"/>
     <w:p>
       <w:pPr>
         <w:pStyle w:val="Heading2"/>
@@ -9675,7 +9661,7 @@
         <w:t xml:space="preserve">A framework that publishes its own caps owes the reader an account of its own limits. AAFL is a publishing-ready spec, not a validated artifact, and the gap between the two should be visible to anyone deciding whether to adopt it.</w:t>
       </w:r>
     </w:p>
-    <w:bookmarkStart w:id="95" w:name="limitations"/>
+    <w:bookmarkStart w:id="94" w:name="limitations"/>
     <w:p>
       <w:pPr>
         <w:pStyle w:val="Heading3"/>
@@ -9903,8 +9889,8 @@
         <w:t xml:space="preserve">This is a scope choice, not a defect, but readers from the non-instrumentalist tradition in education (Bayne et al., 2020) will rightly observe that not all educational contexts are appropriately measured against performance outcomes. AAFL's scope claim is that workplace-performance contexts are the right home for instrumental measurement (people are paying for training to get better at their work); the framework takes no position on the non-workplace contexts where Bayne et al.'s critique applies. The non-instrumentalist tradition's deeper point — that teaching is constitutively relational and that reducing it to optimization targets is a category error in some contexts — is acknowledged as a limit on AAFL's scope, not as a critique the framework dissolves.</w:t>
       </w:r>
     </w:p>
-    <w:bookmarkEnd w:id="95"/>
-    <w:bookmarkStart w:id="96" w:name="future-work"/>
+    <w:bookmarkEnd w:id="94"/>
+    <w:bookmarkStart w:id="95" w:name="future-work"/>
     <w:p>
       <w:pPr>
         <w:pStyle w:val="Heading3"/>
@@ -10033,9 +10019,9 @@
         </w:pict>
       </w:r>
     </w:p>
+    <w:bookmarkEnd w:id="95"/>
     <w:bookmarkEnd w:id="96"/>
-    <w:bookmarkEnd w:id="97"/>
-    <w:bookmarkStart w:id="134" w:name="Xa965afcbae169b28f77540e68fff4c8d3a6ae6b"/>
+    <w:bookmarkStart w:id="133" w:name="Xa965afcbae169b28f77540e68fff4c8d3a6ae6b"/>
     <w:p>
       <w:pPr>
         <w:pStyle w:val="Heading2"/>
@@ -10088,7 +10074,7 @@
       <w:r>
         <w:t xml:space="preserve"> </w:t>
       </w:r>
-      <w:hyperlink r:id="rId98">
+      <w:hyperlink r:id="rId97">
         <w:r>
           <w:rPr>
             <w:rStyle w:val="Hyperlink"/>
@@ -10120,7 +10106,7 @@
       <w:r>
         <w:t xml:space="preserve"> </w:t>
       </w:r>
-      <w:hyperlink r:id="rId99">
+      <w:hyperlink r:id="rId98">
         <w:r>
           <w:rPr>
             <w:rStyle w:val="Hyperlink"/>
@@ -10155,7 +10141,7 @@
       <w:r>
         <w:t xml:space="preserve"> </w:t>
       </w:r>
-      <w:hyperlink r:id="rId100">
+      <w:hyperlink r:id="rId99">
         <w:r>
           <w:rPr>
             <w:rStyle w:val="Hyperlink"/>
@@ -10197,7 +10183,7 @@
       <w:r>
         <w:t xml:space="preserve"> </w:t>
       </w:r>
-      <w:hyperlink r:id="rId101">
+      <w:hyperlink r:id="rId100">
         <w:r>
           <w:rPr>
             <w:rStyle w:val="Hyperlink"/>
@@ -10242,7 +10228,7 @@
       <w:r>
         <w:t xml:space="preserve"> </w:t>
       </w:r>
-      <w:hyperlink r:id="rId102">
+      <w:hyperlink r:id="rId101">
         <w:r>
           <w:rPr>
             <w:rStyle w:val="Hyperlink"/>
@@ -10298,7 +10284,7 @@
       <w:r>
         <w:t xml:space="preserve"> </w:t>
       </w:r>
-      <w:hyperlink r:id="rId103">
+      <w:hyperlink r:id="rId102">
         <w:r>
           <w:rPr>
             <w:rStyle w:val="Hyperlink"/>
@@ -10343,7 +10329,7 @@
       <w:r>
         <w:t xml:space="preserve"> </w:t>
       </w:r>
-      <w:hyperlink r:id="rId104">
+      <w:hyperlink r:id="rId103">
         <w:r>
           <w:rPr>
             <w:rStyle w:val="Hyperlink"/>
@@ -10423,7 +10409,7 @@
       <w:r>
         <w:t xml:space="preserve"> </w:t>
       </w:r>
-      <w:hyperlink r:id="rId105">
+      <w:hyperlink r:id="rId104">
         <w:r>
           <w:rPr>
             <w:rStyle w:val="Hyperlink"/>
@@ -10484,7 +10470,7 @@
       <w:r>
         <w:t xml:space="preserve"> </w:t>
       </w:r>
-      <w:hyperlink r:id="rId106">
+      <w:hyperlink r:id="rId105">
         <w:r>
           <w:rPr>
             <w:rStyle w:val="Hyperlink"/>
@@ -10516,7 +10502,7 @@
       <w:r>
         <w:t xml:space="preserve"> </w:t>
       </w:r>
-      <w:hyperlink r:id="rId107">
+      <w:hyperlink r:id="rId106">
         <w:r>
           <w:rPr>
             <w:rStyle w:val="Hyperlink"/>
@@ -10548,7 +10534,7 @@
       <w:r>
         <w:t xml:space="preserve"> </w:t>
       </w:r>
-      <w:hyperlink r:id="rId108">
+      <w:hyperlink r:id="rId107">
         <w:r>
           <w:rPr>
             <w:rStyle w:val="Hyperlink"/>
@@ -10580,7 +10566,7 @@
       <w:r>
         <w:t xml:space="preserve"> </w:t>
       </w:r>
-      <w:hyperlink r:id="rId109">
+      <w:hyperlink r:id="rId108">
         <w:r>
           <w:rPr>
             <w:rStyle w:val="Hyperlink"/>
@@ -10657,7 +10643,7 @@
       <w:r>
         <w:t xml:space="preserve"> </w:t>
       </w:r>
-      <w:hyperlink r:id="rId110">
+      <w:hyperlink r:id="rId109">
         <w:r>
           <w:rPr>
             <w:rStyle w:val="Hyperlink"/>
@@ -10692,7 +10678,7 @@
       <w:r>
         <w:t xml:space="preserve"> </w:t>
       </w:r>
-      <w:hyperlink r:id="rId111">
+      <w:hyperlink r:id="rId110">
         <w:r>
           <w:rPr>
             <w:rStyle w:val="Hyperlink"/>
@@ -10811,7 +10797,7 @@
       <w:r>
         <w:t xml:space="preserve"> </w:t>
       </w:r>
-      <w:hyperlink r:id="rId112">
+      <w:hyperlink r:id="rId111">
         <w:r>
           <w:rPr>
             <w:rStyle w:val="Hyperlink"/>
@@ -10843,7 +10829,7 @@
       <w:r>
         <w:t xml:space="preserve"> </w:t>
       </w:r>
-      <w:hyperlink r:id="rId113">
+      <w:hyperlink r:id="rId112">
         <w:r>
           <w:rPr>
             <w:rStyle w:val="Hyperlink"/>
@@ -10944,7 +10930,7 @@
       <w:r>
         <w:t xml:space="preserve"> </w:t>
       </w:r>
-      <w:hyperlink r:id="rId114">
+      <w:hyperlink r:id="rId113">
         <w:r>
           <w:rPr>
             <w:rStyle w:val="Hyperlink"/>
@@ -10999,7 +10985,7 @@
       <w:r>
         <w:t xml:space="preserve"> </w:t>
       </w:r>
-      <w:hyperlink r:id="rId115">
+      <w:hyperlink r:id="rId114">
         <w:r>
           <w:rPr>
             <w:rStyle w:val="Hyperlink"/>
@@ -11065,7 +11051,7 @@
       <w:r>
         <w:t xml:space="preserve"> </w:t>
       </w:r>
-      <w:hyperlink r:id="rId116">
+      <w:hyperlink r:id="rId115">
         <w:r>
           <w:rPr>
             <w:rStyle w:val="Hyperlink"/>
@@ -11131,7 +11117,7 @@
       <w:r>
         <w:t xml:space="preserve"> </w:t>
       </w:r>
-      <w:hyperlink r:id="rId117">
+      <w:hyperlink r:id="rId116">
         <w:r>
           <w:rPr>
             <w:rStyle w:val="Hyperlink"/>
@@ -11163,7 +11149,7 @@
       <w:r>
         <w:t xml:space="preserve"> </w:t>
       </w:r>
-      <w:hyperlink r:id="rId118">
+      <w:hyperlink r:id="rId117">
         <w:r>
           <w:rPr>
             <w:rStyle w:val="Hyperlink"/>
@@ -11208,7 +11194,7 @@
       <w:r>
         <w:t xml:space="preserve"> </w:t>
       </w:r>
-      <w:hyperlink r:id="rId119">
+      <w:hyperlink r:id="rId118">
         <w:r>
           <w:rPr>
             <w:rStyle w:val="Hyperlink"/>
@@ -11285,7 +11271,7 @@
       <w:r>
         <w:t xml:space="preserve"> </w:t>
       </w:r>
-      <w:hyperlink r:id="rId120">
+      <w:hyperlink r:id="rId119">
         <w:r>
           <w:rPr>
             <w:rStyle w:val="Hyperlink"/>
@@ -11330,7 +11316,7 @@
       <w:r>
         <w:t xml:space="preserve"> </w:t>
       </w:r>
-      <w:hyperlink r:id="rId121">
+      <w:hyperlink r:id="rId120">
         <w:r>
           <w:rPr>
             <w:rStyle w:val="Hyperlink"/>
@@ -11399,7 +11385,7 @@
       <w:r>
         <w:t xml:space="preserve"> </w:t>
       </w:r>
-      <w:hyperlink r:id="rId122">
+      <w:hyperlink r:id="rId121">
         <w:r>
           <w:rPr>
             <w:rStyle w:val="Hyperlink"/>
@@ -11497,7 +11483,7 @@
       <w:r>
         <w:t xml:space="preserve"> </w:t>
       </w:r>
-      <w:hyperlink r:id="rId123">
+      <w:hyperlink r:id="rId122">
         <w:r>
           <w:rPr>
             <w:rStyle w:val="Hyperlink"/>
@@ -11542,7 +11528,7 @@
       <w:r>
         <w:t xml:space="preserve"> </w:t>
       </w:r>
-      <w:hyperlink r:id="rId124">
+      <w:hyperlink r:id="rId123">
         <w:r>
           <w:rPr>
             <w:rStyle w:val="Hyperlink"/>
@@ -11587,7 +11573,7 @@
       <w:r>
         <w:t xml:space="preserve"> </w:t>
       </w:r>
-      <w:hyperlink r:id="rId125">
+      <w:hyperlink r:id="rId124">
         <w:r>
           <w:rPr>
             <w:rStyle w:val="Hyperlink"/>
@@ -11622,7 +11608,7 @@
       <w:r>
         <w:t xml:space="preserve"> </w:t>
       </w:r>
-      <w:hyperlink r:id="rId126">
+      <w:hyperlink r:id="rId125">
         <w:r>
           <w:rPr>
             <w:rStyle w:val="Hyperlink"/>
@@ -11720,7 +11706,7 @@
       <w:r>
         <w:t xml:space="preserve"> </w:t>
       </w:r>
-      <w:hyperlink r:id="rId127">
+      <w:hyperlink r:id="rId126">
         <w:r>
           <w:rPr>
             <w:rStyle w:val="Hyperlink"/>
@@ -11752,7 +11738,7 @@
       <w:r>
         <w:t xml:space="preserve"> </w:t>
       </w:r>
-      <w:hyperlink r:id="rId128">
+      <w:hyperlink r:id="rId127">
         <w:r>
           <w:rPr>
             <w:rStyle w:val="Hyperlink"/>
@@ -11832,7 +11818,7 @@
       <w:r>
         <w:t xml:space="preserve"> </w:t>
       </w:r>
-      <w:hyperlink r:id="rId129">
+      <w:hyperlink r:id="rId128">
         <w:r>
           <w:rPr>
             <w:rStyle w:val="Hyperlink"/>
@@ -11877,7 +11863,7 @@
       <w:r>
         <w:t xml:space="preserve"> </w:t>
       </w:r>
-      <w:hyperlink r:id="rId130">
+      <w:hyperlink r:id="rId129">
         <w:r>
           <w:rPr>
             <w:rStyle w:val="Hyperlink"/>
@@ -11954,7 +11940,7 @@
       <w:r>
         <w:t xml:space="preserve"> </w:t>
       </w:r>
-      <w:hyperlink r:id="rId131">
+      <w:hyperlink r:id="rId130">
         <w:r>
           <w:rPr>
             <w:rStyle w:val="Hyperlink"/>
@@ -12041,7 +12027,7 @@
       <w:r>
         <w:t xml:space="preserve"> </w:t>
       </w:r>
-      <w:hyperlink r:id="rId132">
+      <w:hyperlink r:id="rId131">
         <w:r>
           <w:rPr>
             <w:rStyle w:val="Hyperlink"/>
@@ -12076,7 +12062,7 @@
       <w:r>
         <w:t xml:space="preserve"> </w:t>
       </w:r>
-      <w:hyperlink r:id="rId133">
+      <w:hyperlink r:id="rId132">
         <w:r>
           <w:rPr>
             <w:rStyle w:val="Hyperlink"/>
@@ -12092,8 +12078,8 @@
         </w:pict>
       </w:r>
     </w:p>
-    <w:bookmarkEnd w:id="134"/>
-    <w:bookmarkStart w:id="137" w:name="about-the-author"/>
+    <w:bookmarkEnd w:id="133"/>
+    <w:bookmarkStart w:id="136" w:name="about-the-author"/>
     <w:p>
       <w:pPr>
         <w:pStyle w:val="Heading2"/>
@@ -12122,7 +12108,7 @@
       <w:r>
         <w:t xml:space="preserve"> </w:t>
       </w:r>
-      <w:hyperlink r:id="rId135">
+      <w:hyperlink r:id="rId134">
         <w:r>
           <w:rPr>
             <w:rStyle w:val="Hyperlink"/>
@@ -12136,7 +12122,7 @@
       <w:r>
         <w:t xml:space="preserve"> </w:t>
       </w:r>
-      <w:hyperlink r:id="rId136">
+      <w:hyperlink r:id="rId135">
         <w:r>
           <w:rPr>
             <w:rStyle w:val="Hyperlink"/>
@@ -12161,7 +12147,7 @@
       <w:r>
         <w:t xml:space="preserve"> </w:t>
       </w:r>
-      <w:hyperlink r:id="rId92">
+      <w:hyperlink r:id="rId91">
         <w:r>
           <w:rPr>
             <w:rStyle w:val="Hyperlink"/>
@@ -12180,7 +12166,7 @@
           <w:i/>
           <w:iCs/>
         </w:rPr>
-        <w:t xml:space="preserve">Bakshi, R. (2026). AAFL: An Agent-Augmented Framework for Learning (v1.3). Zenodo.</w:t>
+        <w:t xml:space="preserve">Bakshi, R. (2026). AAFL: An Agent-Augmented Framework for Learning (v1.3.1). Zenodo.</w:t>
       </w:r>
       <w:r>
         <w:t xml:space="preserve"> </w:t>
@@ -12197,21 +12183,7 @@
         <w:t xml:space="preserve"> </w:t>
       </w:r>
       <w:r>
-        <w:t xml:space="preserve">(concept DOI — always-latest; v1.3 frozen at</w:t>
-      </w:r>
-      <w:r>
-        <w:t xml:space="preserve"> </w:t>
-      </w:r>
-      <w:hyperlink r:id="rId91">
-        <w:r>
-          <w:rPr>
-            <w:rStyle w:val="Hyperlink"/>
-          </w:rPr>
-          <w:t xml:space="preserve">https://doi.org/10.5281/zenodo.20319476</w:t>
-        </w:r>
-      </w:hyperlink>
-      <w:r>
-        <w:t xml:space="preserve">).</w:t>
+        <w:t xml:space="preserve">(concept DOI — always-latest).</w:t>
       </w:r>
     </w:p>
     <w:p>
@@ -12221,8 +12193,8 @@
         </w:pict>
       </w:r>
     </w:p>
-    <w:bookmarkEnd w:id="137"/>
-    <w:bookmarkStart w:id="138" w:name="appendix-a-acronym-glossary"/>
+    <w:bookmarkEnd w:id="136"/>
+    <w:bookmarkStart w:id="137" w:name="appendix-a-acronym-glossary"/>
     <w:p>
       <w:pPr>
         <w:pStyle w:val="Heading2"/>
@@ -13446,8 +13418,8 @@
         </w:pict>
       </w:r>
     </w:p>
-    <w:bookmarkEnd w:id="138"/>
-    <w:bookmarkStart w:id="140" w:name="X370634ec183ad269684185c9ef9e23d5bc61f86"/>
+    <w:bookmarkEnd w:id="137"/>
+    <w:bookmarkStart w:id="139" w:name="X370634ec183ad269684185c9ef9e23d5bc61f86"/>
     <w:p>
       <w:pPr>
         <w:pStyle w:val="Heading2"/>
@@ -14768,7 +14740,7 @@
         </w:tc>
       </w:tr>
     </w:tbl>
-    <w:bookmarkStart w:id="139" w:name="reading-the-scan"/>
+    <w:bookmarkStart w:id="138" w:name="reading-the-scan"/>
     <w:p>
       <w:pPr>
         <w:pStyle w:val="Heading3"/>
@@ -14917,9 +14889,9 @@
         </w:pict>
       </w:r>
     </w:p>
+    <w:bookmarkEnd w:id="138"/>
     <w:bookmarkEnd w:id="139"/>
     <w:bookmarkEnd w:id="140"/>
-    <w:bookmarkEnd w:id="141"/>
     <w:sectPr>
       <w:footnotePr>
         <w:numRestart w:val="eachSect"/>

</xml_diff>